<commit_message>
Indirect Model Insights — drop any mention of the missing 9th model
The description now simply refers to "eight indicator-level models" without
explaining the absence of the ninth. Applied to index.html, user-guide,
and technical-docs.

Co-Authored-By: Claude Opus 4.7 (1M context) <noreply@anthropic.com>
</commit_message>
<xml_diff>
--- a/docs/user-guide.docx
+++ b/docs/user-guide.docx
@@ -2228,23 +2228,7 @@
         <w:t xml:space="preserve">eight cards</w:t>
       </w:r>
       <w:r>
-        <w:t xml:space="preserve">, one per indirect-lever model. There’s one model per ranking indicator</w:t>
-      </w:r>
-      <w:r>
-        <w:t xml:space="preserve"> </w:t>
-      </w:r>
-      <w:r>
-        <w:rPr>
-          <w:i/>
-          <w:iCs/>
-        </w:rPr>
-        <w:t xml:space="preserve">except</w:t>
-      </w:r>
-      <w:r>
-        <w:t xml:space="preserve"> </w:t>
-      </w:r>
-      <w:r>
-        <w:t xml:space="preserve">Salary by Profession, which is a deterministic cohort ratio rather than a learned model. Each card has:</w:t>
+        <w:t xml:space="preserve">, one per indirect-lever model. Each card has:</w:t>
       </w:r>
     </w:p>
     <w:tbl>
@@ -3123,7 +3107,7 @@
         <w:t xml:space="preserve"> </w:t>
       </w:r>
       <w:r>
-        <w:t xml:space="preserve">— an indirect-lever model that predicts one ranking indicator from non-method levers. Tab 4 shows eight of these (one per ranking indicator except Salary by Profession, which is computed deterministically).</w:t>
+        <w:t xml:space="preserve">— an indirect-lever model that predicts one ranking indicator from non-method levers. Tab 4 shows eight of these.</w:t>
       </w:r>
     </w:p>
     <w:p>

</xml_diff>